<commit_message>
further editing of docs
</commit_message>
<xml_diff>
--- a/docs/Signyales_Software_Requirements.docx
+++ b/docs/Signyales_Software_Requirements.docx
@@ -29,7 +29,7 @@
           <w:sz w:val="24"/>
           <w:szCs w:val="24"/>
         </w:rPr>
-        <w:t xml:space="preserve">This section identifies the software components required to implement the Signyales system, organized by the physical layer on which each component runs. The system is composed of four cooperating software layers: glove-node firmware, receiver-dongle firmware, central hub software on the Raspberry Pi 4, and an offline machine learning development pipeline used to produce the TinyML model deployed at runtime. Each layer is described below, followed by a consolidated software requirements matrix.</w:t>
+        <w:t xml:space="preserve">This section identifies the software components required to implement the Signyales system, organized by the physical layer on which each component runs. The system is composed of four cooperating software layers: glove-node firmware, receiver-dongle firmware, central hub software on the Raspberry Pi 5, and an offline machine learning development pipeline used to produce the TinyML model deployed at runtime. Each layer is described below, followed by a consolidated software requirements matrix.</w:t>
       </w:r>
     </w:p>
     <w:p>
@@ -234,7 +234,7 @@
           <w:sz w:val="24"/>
           <w:szCs w:val="24"/>
         </w:rPr>
-        <w:t xml:space="preserve">UART/Serial forwarding of the synchronized data to the Raspberry Pi 4.</w:t>
+        <w:t xml:space="preserve">UART/Serial forwarding of the synchronized data to the Raspberry Pi 5.</w:t>
       </w:r>
     </w:p>
     <w:p>
@@ -268,7 +268,7 @@
           <w:sz w:val="26"/>
           <w:szCs w:val="26"/>
         </w:rPr>
-        <w:t xml:space="preserve">3. Central Hub Software (Raspberry Pi 4)</w:t>
+        <w:t xml:space="preserve">3. Central Hub Software (Raspberry Pi 5)</w:t>
       </w:r>
     </w:p>
     <w:p>
@@ -282,7 +282,7 @@
           <w:sz w:val="24"/>
           <w:szCs w:val="24"/>
         </w:rPr>
-        <w:t xml:space="preserve">The Raspberry Pi 4 is the system's central processing unit and requires the most extensive software stack, covering data ingestion, inference, translation, and speech output.</w:t>
+        <w:t xml:space="preserve">The Raspberry Pi 5 is the system's central processing unit and requires the most extensive software stack, covering data ingestion, inference, translation, and speech output.</w:t>
       </w:r>
     </w:p>
     <w:p>

</xml_diff>